<commit_message>
docs: replace mermaid text blocks with rendered png images
</commit_message>
<xml_diff>
--- a/PublishAI_Onboarding.docx
+++ b/PublishAI_Onboarding.docx
@@ -336,44 +336,43 @@
     </w:p>
     <w:p>
       <w:r/>
-      <w:r>
-        <w:rPr>
-          <w:rFonts w:ascii="Courier" w:hAnsi="Courier"/>
-        </w:rPr>
-        <w:t>flowchart TD</w:t>
-        <w:br/>
-        <w:t xml:space="preserve">    Client[Client UI / Browser]</w:t>
-        <w:br/>
-        <w:t xml:space="preserve">    NextApp[Next.js App Router]</w:t>
-        <w:br/>
-        <w:t xml:space="preserve">    NextAPI[Next.js API Routes / BFF]</w:t>
-        <w:br/>
-        <w:t xml:space="preserve">    ExtServices[External Services: DB, LLMs, MCP, RPA]</w:t>
-        <w:br/>
-        <w:br/>
-        <w:t xml:space="preserve">    Client -- "Interacts with UI (Client Components)" --&gt; NextApp</w:t>
-        <w:br/>
-        <w:t xml:space="preserve">    NextApp -- "Server Actions / API Calls" --&gt; NextAPI</w:t>
-        <w:br/>
-        <w:t xml:space="preserve">    NextAPI -- "Backend Logic, Auth, Streams" --&gt; ExtServices</w:t>
-        <w:br/>
-        <w:br/>
-        <w:t xml:space="preserve">    subgraph Client UI</w:t>
-        <w:br/>
-        <w:t xml:space="preserve">        Layout[App Shell / Layouts]</w:t>
-        <w:br/>
-        <w:t xml:space="preserve">        Widgets[Interactive Widgets: AgentRunner, SubmissionTracker]</w:t>
-        <w:br/>
-        <w:t xml:space="preserve">        Views[Page Views]</w:t>
-        <w:br/>
-        <w:t xml:space="preserve">        Layout --&gt; Views</w:t>
-        <w:br/>
-        <w:t xml:space="preserve">        Views --&gt; Widgets</w:t>
-        <w:br/>
-        <w:t xml:space="preserve">    end</w:t>
-        <w:br/>
-      </w:r>
-      <w:r/>
+      <w:r/>
+    </w:p>
+    <w:p>
+      <w:r>
+        <w:drawing>
+          <wp:inline xmlns:a="http://schemas.openxmlformats.org/drawingml/2006/main" xmlns:pic="http://schemas.openxmlformats.org/drawingml/2006/picture">
+            <wp:extent cx="5626100" cy="11671300"/>
+            <wp:docPr id="1" name="Picture 1"/>
+            <wp:cNvGraphicFramePr>
+              <a:graphicFrameLocks noChangeAspect="1"/>
+            </wp:cNvGraphicFramePr>
+            <a:graphic>
+              <a:graphicData uri="http://schemas.openxmlformats.org/drawingml/2006/picture">
+                <pic:pic>
+                  <pic:nvPicPr>
+                    <pic:cNvPr id="0" name="frontend_analysis_diagram_1.png"/>
+                    <pic:cNvPicPr/>
+                  </pic:nvPicPr>
+                  <pic:blipFill>
+                    <a:blip r:embed="rId9"/>
+                    <a:stretch>
+                      <a:fillRect/>
+                    </a:stretch>
+                  </pic:blipFill>
+                  <pic:spPr>
+                    <a:xfrm>
+                      <a:off x="0" y="0"/>
+                      <a:ext cx="5626100" cy="11671300"/>
+                    </a:xfrm>
+                    <a:prstGeom prst="rect"/>
+                  </pic:spPr>
+                </pic:pic>
+              </a:graphicData>
+            </a:graphic>
+          </wp:inline>
+        </w:drawing>
+      </w:r>
     </w:p>
     <w:p>
       <w:pPr>
@@ -614,30 +613,43 @@
     </w:p>
     <w:p>
       <w:r/>
-      <w:r>
-        <w:rPr>
-          <w:rFonts w:ascii="Courier" w:hAnsi="Courier"/>
-        </w:rPr>
-        <w:t>stateDiagram-v2</w:t>
-        <w:br/>
-        <w:t xml:space="preserve">    [*] --&gt; IDLE : Component Mounted</w:t>
-        <w:br/>
-        <w:t xml:space="preserve">    IDLE --&gt; RUNNING : User clicks "Start"</w:t>
-        <w:br/>
-        <w:t xml:space="preserve">    RUNNING --&gt; PAUSED : Receives "interrupt" event</w:t>
-        <w:br/>
-        <w:t xml:space="preserve">    PAUSED --&gt; RUNNING : User provides feedback &amp; resumes</w:t>
-        <w:br/>
-        <w:t xml:space="preserve">    RUNNING --&gt; COMPLETED : Receives "end" event</w:t>
-        <w:br/>
-        <w:t xml:space="preserve">    RUNNING --&gt; ERROR : Catch stream/network errors</w:t>
-        <w:br/>
-        <w:t xml:space="preserve">    COMPLETED --&gt; [*]</w:t>
-        <w:br/>
-        <w:t xml:space="preserve">    ERROR --&gt; [*]</w:t>
-        <w:br/>
-      </w:r>
-      <w:r/>
+      <w:r/>
+    </w:p>
+    <w:p>
+      <w:r>
+        <w:drawing>
+          <wp:inline xmlns:a="http://schemas.openxmlformats.org/drawingml/2006/main" xmlns:pic="http://schemas.openxmlformats.org/drawingml/2006/picture">
+            <wp:extent cx="9956800" cy="6819900"/>
+            <wp:docPr id="2" name="Picture 2"/>
+            <wp:cNvGraphicFramePr>
+              <a:graphicFrameLocks noChangeAspect="1"/>
+            </wp:cNvGraphicFramePr>
+            <a:graphic>
+              <a:graphicData uri="http://schemas.openxmlformats.org/drawingml/2006/picture">
+                <pic:pic>
+                  <pic:nvPicPr>
+                    <pic:cNvPr id="0" name="frontend_analysis_diagram_2.png"/>
+                    <pic:cNvPicPr/>
+                  </pic:nvPicPr>
+                  <pic:blipFill>
+                    <a:blip r:embed="rId10"/>
+                    <a:stretch>
+                      <a:fillRect/>
+                    </a:stretch>
+                  </pic:blipFill>
+                  <pic:spPr>
+                    <a:xfrm>
+                      <a:off x="0" y="0"/>
+                      <a:ext cx="9956800" cy="6819900"/>
+                    </a:xfrm>
+                    <a:prstGeom prst="rect"/>
+                  </pic:spPr>
+                </pic:pic>
+              </a:graphicData>
+            </a:graphic>
+          </wp:inline>
+        </w:drawing>
+      </w:r>
     </w:p>
     <w:p>
       <w:pPr>
@@ -785,50 +797,43 @@
     </w:p>
     <w:p>
       <w:r/>
-      <w:r>
-        <w:rPr>
-          <w:rFonts w:ascii="Courier" w:hAnsi="Courier"/>
-        </w:rPr>
-        <w:t>stateDiagram-v2</w:t>
-        <w:br/>
-        <w:t xml:space="preserve">    direction LR</w:t>
-        <w:br/>
-        <w:t xml:space="preserve">    [*] --&gt; Initializing</w:t>
-        <w:br/>
-        <w:t xml:space="preserve">    Initializing --&gt; Logging_In</w:t>
-        <w:br/>
-        <w:t xml:space="preserve">    Logging_In --&gt; Uploading_Files</w:t>
-        <w:br/>
-        <w:t xml:space="preserve">    Uploading_Files --&gt; Filling_Forms</w:t>
-        <w:br/>
-        <w:t xml:space="preserve">    Filling_Forms --&gt; Finalizing</w:t>
-        <w:br/>
-        <w:br/>
-        <w:t xml:space="preserve">    Logging_In --&gt; Paused : 2FA Required</w:t>
-        <w:br/>
-        <w:t xml:space="preserve">    Uploading_Files --&gt; Paused : Captcha / Error</w:t>
-        <w:br/>
-        <w:t xml:space="preserve">    Filling_Forms --&gt; Paused : Ambiguous Input</w:t>
-        <w:br/>
-        <w:br/>
-        <w:t xml:space="preserve">    Paused --&gt; Logging_In : User resolves</w:t>
-        <w:br/>
-        <w:t xml:space="preserve">    Paused --&gt; Uploading_Files : User resolves</w:t>
-        <w:br/>
-        <w:t xml:space="preserve">    Paused --&gt; Filling_Forms : User resolves</w:t>
-        <w:br/>
-        <w:br/>
-        <w:t xml:space="preserve">    Finalizing --&gt; Completed</w:t>
-        <w:br/>
-        <w:t xml:space="preserve">    Finalizing --&gt; Failed</w:t>
-        <w:br/>
-        <w:br/>
-        <w:t xml:space="preserve">    Completed --&gt; [*]</w:t>
-        <w:br/>
-        <w:t xml:space="preserve">    Failed --&gt; [*]</w:t>
-        <w:br/>
-      </w:r>
-      <w:r/>
+      <w:r/>
+    </w:p>
+    <w:p>
+      <w:r>
+        <w:drawing>
+          <wp:inline xmlns:a="http://schemas.openxmlformats.org/drawingml/2006/main" xmlns:pic="http://schemas.openxmlformats.org/drawingml/2006/picture">
+            <wp:extent cx="9956800" cy="2819400"/>
+            <wp:docPr id="3" name="Picture 3"/>
+            <wp:cNvGraphicFramePr>
+              <a:graphicFrameLocks noChangeAspect="1"/>
+            </wp:cNvGraphicFramePr>
+            <a:graphic>
+              <a:graphicData uri="http://schemas.openxmlformats.org/drawingml/2006/picture">
+                <pic:pic>
+                  <pic:nvPicPr>
+                    <pic:cNvPr id="0" name="frontend_analysis_diagram_3.png"/>
+                    <pic:cNvPicPr/>
+                  </pic:nvPicPr>
+                  <pic:blipFill>
+                    <a:blip r:embed="rId11"/>
+                    <a:stretch>
+                      <a:fillRect/>
+                    </a:stretch>
+                  </pic:blipFill>
+                  <pic:spPr>
+                    <a:xfrm>
+                      <a:off x="0" y="0"/>
+                      <a:ext cx="9956800" cy="2819400"/>
+                    </a:xfrm>
+                    <a:prstGeom prst="rect"/>
+                  </pic:spPr>
+                </pic:pic>
+              </a:graphicData>
+            </a:graphic>
+          </wp:inline>
+        </w:drawing>
+      </w:r>
     </w:p>
     <w:p>
       <w:pPr>
@@ -1024,57 +1029,43 @@
     </w:p>
     <w:p>
       <w:r/>
-      <w:r>
-        <w:rPr>
-          <w:rFonts w:ascii="Courier" w:hAnsi="Courier"/>
-        </w:rPr>
-        <w:t>sequenceDiagram</w:t>
-        <w:br/>
-        <w:t xml:space="preserve">    participant User</w:t>
-        <w:br/>
-        <w:t xml:space="preserve">    participant AgentRunner (UI)</w:t>
-        <w:br/>
-        <w:t xml:space="preserve">    participant NextAPI as Next.js API (/agents/run)</w:t>
-        <w:br/>
-        <w:t xml:space="preserve">    participant LangGraph Engine</w:t>
-        <w:br/>
-        <w:br/>
-        <w:t xml:space="preserve">    User-&gt;&gt;AgentRunner (UI): Click "Start AI Pipeline"</w:t>
-        <w:br/>
-        <w:t xml:space="preserve">    AgentRunner (UI)-&gt;&gt;NextAPI: POST { action: "start", paperId }</w:t>
-        <w:br/>
-        <w:t xml:space="preserve">    NextAPI-&gt;&gt;LangGraph Engine: Invoke Graph</w:t>
-        <w:br/>
-        <w:br/>
-        <w:t xml:space="preserve">    LangGraph Engine--&gt;&gt;NextAPI: Yield Logs (SSE)</w:t>
-        <w:br/>
-        <w:t xml:space="preserve">    NextAPI--&gt;&gt;AgentRunner (UI): data: { type: "log", message: "..." }</w:t>
-        <w:br/>
-        <w:t xml:space="preserve">    AgentRunner (UI)--&gt;&gt;User: Display logs real-time</w:t>
-        <w:br/>
-        <w:br/>
-        <w:t xml:space="preserve">    LangGraph Engine--&gt;&gt;NextAPI: Yield Interrupt (Requires Input)</w:t>
-        <w:br/>
-        <w:t xml:space="preserve">    NextAPI--&gt;&gt;AgentRunner (UI): data: { type: "interrupt" }</w:t>
-        <w:br/>
-        <w:t xml:space="preserve">    AgentRunner (UI)--&gt;&gt;User: Show PAUSED state &amp; text area</w:t>
-        <w:br/>
-        <w:br/>
-        <w:t xml:space="preserve">    User-&gt;&gt;AgentRunner (UI): Enter feedback &amp; click Resume</w:t>
-        <w:br/>
-        <w:t xml:space="preserve">    AgentRunner (UI)-&gt;&gt;NextAPI: POST { action: "resume", feedback }</w:t>
-        <w:br/>
-        <w:t xml:space="preserve">    NextAPI-&gt;&gt;LangGraph Engine: Resume Graph State</w:t>
-        <w:br/>
-        <w:br/>
-        <w:t xml:space="preserve">    LangGraph Engine--&gt;&gt;NextAPI: Yield End</w:t>
-        <w:br/>
-        <w:t xml:space="preserve">    NextAPI--&gt;&gt;AgentRunner (UI): data: { type: "end" }</w:t>
-        <w:br/>
-        <w:t xml:space="preserve">    AgentRunner (UI)--&gt;&gt;User: Show COMPLETED state</w:t>
-        <w:br/>
-      </w:r>
-      <w:r/>
+      <w:r/>
+    </w:p>
+    <w:p>
+      <w:r>
+        <w:drawing>
+          <wp:inline xmlns:a="http://schemas.openxmlformats.org/drawingml/2006/main" xmlns:pic="http://schemas.openxmlformats.org/drawingml/2006/picture">
+            <wp:extent cx="9956800" cy="7848600"/>
+            <wp:docPr id="4" name="Picture 4"/>
+            <wp:cNvGraphicFramePr>
+              <a:graphicFrameLocks noChangeAspect="1"/>
+            </wp:cNvGraphicFramePr>
+            <a:graphic>
+              <a:graphicData uri="http://schemas.openxmlformats.org/drawingml/2006/picture">
+                <pic:pic>
+                  <pic:nvPicPr>
+                    <pic:cNvPr id="0" name="frontend_analysis_diagram_4.png"/>
+                    <pic:cNvPicPr/>
+                  </pic:nvPicPr>
+                  <pic:blipFill>
+                    <a:blip r:embed="rId12"/>
+                    <a:stretch>
+                      <a:fillRect/>
+                    </a:stretch>
+                  </pic:blipFill>
+                  <pic:spPr>
+                    <a:xfrm>
+                      <a:off x="0" y="0"/>
+                      <a:ext cx="9956800" cy="7848600"/>
+                    </a:xfrm>
+                    <a:prstGeom prst="rect"/>
+                  </pic:spPr>
+                </pic:pic>
+              </a:graphicData>
+            </a:graphic>
+          </wp:inline>
+        </w:drawing>
+      </w:r>
     </w:p>
     <w:p>
       <w:pPr>
@@ -1087,64 +1078,43 @@
     </w:p>
     <w:p>
       <w:r/>
-      <w:r>
-        <w:rPr>
-          <w:rFonts w:ascii="Courier" w:hAnsi="Courier"/>
-        </w:rPr>
-        <w:t>sequenceDiagram</w:t>
-        <w:br/>
-        <w:t xml:space="preserve">    participant User</w:t>
-        <w:br/>
-        <w:t xml:space="preserve">    participant SubTracker as SubmissionTracker (UI)</w:t>
-        <w:br/>
-        <w:t xml:space="preserve">    participant NextAPI as Next.js API (/rpa)</w:t>
-        <w:br/>
-        <w:t xml:space="preserve">    participant RPA as RPA Bot Engine (Selenium)</w:t>
-        <w:br/>
-        <w:br/>
-        <w:t xml:space="preserve">    User-&gt;&gt;SubTracker: Load Tracker with jobId</w:t>
-        <w:br/>
-        <w:t xml:space="preserve">    loop Every 3 Seconds</w:t>
-        <w:br/>
-        <w:t xml:space="preserve">        SubTracker-&gt;&gt;NextAPI: GET /api/rpa/status/{jobId}</w:t>
-        <w:br/>
-        <w:t xml:space="preserve">        NextAPI-&gt;&gt;RPA: Check state</w:t>
-        <w:br/>
-        <w:t xml:space="preserve">        RPA--&gt;&gt;NextAPI: return { status: "uploading", progress: 50 }</w:t>
-        <w:br/>
-        <w:t xml:space="preserve">        NextAPI--&gt;&gt;SubTracker: { status: "uploading" }</w:t>
-        <w:br/>
-        <w:t xml:space="preserve">        SubTracker--&gt;&gt;User: Update Progress Bar</w:t>
-        <w:br/>
-        <w:t xml:space="preserve">    end</w:t>
-        <w:br/>
-        <w:br/>
-        <w:t xml:space="preserve">    RPA--&gt;&gt;NextAPI: Encounters Captcha</w:t>
-        <w:br/>
-        <w:t xml:space="preserve">    NextAPI--&gt;&gt;SubTracker: { status: "paused", message: "Captcha Required" }</w:t>
-        <w:br/>
-        <w:t xml:space="preserve">    SubTracker--&gt;&gt;User: Show HumanInterventionModal</w:t>
-        <w:br/>
-        <w:br/>
-        <w:t xml:space="preserve">    User-&gt;&gt;SubTracker: Solve Captcha &amp; Submit</w:t>
-        <w:br/>
-        <w:t xml:space="preserve">    SubTracker-&gt;&gt;NextAPI: POST /api/rpa/resume/{jobId} { input: "solution" }</w:t>
-        <w:br/>
-        <w:t xml:space="preserve">    NextAPI-&gt;&gt;RPA: Resume with input</w:t>
-        <w:br/>
-        <w:br/>
-        <w:t xml:space="preserve">    loop Every 3 Seconds</w:t>
-        <w:br/>
-        <w:t xml:space="preserve">        SubTracker-&gt;&gt;NextAPI: Poll status...</w:t>
-        <w:br/>
-        <w:t xml:space="preserve">        NextAPI--&gt;&gt;SubTracker: { status: "completed" }</w:t>
-        <w:br/>
-        <w:t xml:space="preserve">    end</w:t>
-        <w:br/>
-        <w:t xml:space="preserve">    SubTracker--&gt;&gt;User: Show Completion State</w:t>
-        <w:br/>
-      </w:r>
-      <w:r/>
+      <w:r/>
+    </w:p>
+    <w:p>
+      <w:r>
+        <w:drawing>
+          <wp:inline xmlns:a="http://schemas.openxmlformats.org/drawingml/2006/main" xmlns:pic="http://schemas.openxmlformats.org/drawingml/2006/picture">
+            <wp:extent cx="9956800" cy="7594600"/>
+            <wp:docPr id="5" name="Picture 5"/>
+            <wp:cNvGraphicFramePr>
+              <a:graphicFrameLocks noChangeAspect="1"/>
+            </wp:cNvGraphicFramePr>
+            <a:graphic>
+              <a:graphicData uri="http://schemas.openxmlformats.org/drawingml/2006/picture">
+                <pic:pic>
+                  <pic:nvPicPr>
+                    <pic:cNvPr id="0" name="frontend_analysis_diagram_5.png"/>
+                    <pic:cNvPicPr/>
+                  </pic:nvPicPr>
+                  <pic:blipFill>
+                    <a:blip r:embed="rId13"/>
+                    <a:stretch>
+                      <a:fillRect/>
+                    </a:stretch>
+                  </pic:blipFill>
+                  <pic:spPr>
+                    <a:xfrm>
+                      <a:off x="0" y="0"/>
+                      <a:ext cx="9956800" cy="7594600"/>
+                    </a:xfrm>
+                    <a:prstGeom prst="rect"/>
+                  </pic:spPr>
+                </pic:pic>
+              </a:graphicData>
+            </a:graphic>
+          </wp:inline>
+        </w:drawing>
+      </w:r>
     </w:p>
     <w:p>
       <w:pPr>
@@ -1345,113 +1315,43 @@
     </w:p>
     <w:p>
       <w:r/>
-      <w:r>
-        <w:rPr>
-          <w:rFonts w:ascii="Courier" w:hAnsi="Courier"/>
-        </w:rPr>
-        <w:t>flowchart TD</w:t>
-        <w:br/>
-        <w:t xml:space="preserve">    %% Define styles</w:t>
-        <w:br/>
-        <w:t xml:space="preserve">    classDef frontend fill:#3b82f6,stroke:#1e3a8a,stroke-width:2px,color:white;</w:t>
-        <w:br/>
-        <w:t xml:space="preserve">    classDef api fill:#10b981,stroke:#047857,stroke-width:2px,color:white;</w:t>
-        <w:br/>
-        <w:t xml:space="preserve">    classDef orchestration fill:#f59e0b,stroke:#b45309,stroke-width:2px,color:white;</w:t>
-        <w:br/>
-        <w:t xml:space="preserve">    classDef ai fill:#8b5cf6,stroke:#4c1d95,stroke-width:2px,color:white;</w:t>
-        <w:br/>
-        <w:t xml:space="preserve">    classDef db fill:#ef4444,stroke:#991b1b,stroke-width:2px,color:white;</w:t>
-        <w:br/>
-        <w:t xml:space="preserve">    classDef external fill:#6b7280,stroke:#374151,stroke-width:2px,color:white;</w:t>
-        <w:br/>
-        <w:br/>
-        <w:t xml:space="preserve">    %% Nodes</w:t>
-        <w:br/>
-        <w:t xml:space="preserve">    Client((Client App)):::frontend</w:t>
-        <w:br/>
-        <w:t xml:space="preserve">    API[Next.js API Routes /api]:::api</w:t>
-        <w:br/>
-        <w:t xml:space="preserve">    Inngest[Inngest Background Workers]:::orchestration</w:t>
-        <w:br/>
-        <w:t xml:space="preserve">    Orchestrator[Agent Orchestrator]:::orchestration</w:t>
-        <w:br/>
-        <w:t xml:space="preserve">    DB[(Neon PostgreSQL\nServerless)]:::db</w:t>
-        <w:br/>
-        <w:t xml:space="preserve">    Mem0[(Mem0 User Memory)]:::db</w:t>
-        <w:br/>
-        <w:t xml:space="preserve">    Langfuse[Langfuse Tracing]:::external</w:t>
-        <w:br/>
-        <w:t xml:space="preserve">    E2B[E2B Python Sandbox]:::external</w:t>
-        <w:br/>
-        <w:t xml:space="preserve">    Stripe[Stripe / Webhooks]:::external</w:t>
-        <w:br/>
-        <w:br/>
-        <w:t xml:space="preserve">    %% AI Agents</w:t>
-        <w:br/>
-        <w:t xml:space="preserve">    subgraph Multi-Agent System</w:t>
-        <w:br/>
-        <w:t xml:space="preserve">        Clarification[Clarification Agent]:::ai</w:t>
-        <w:br/>
-        <w:t xml:space="preserve">        Planning[Planning Agent]:::ai</w:t>
-        <w:br/>
-        <w:t xml:space="preserve">        Knowledge[Knowledge / RAG Agent]:::ai</w:t>
-        <w:br/>
-        <w:t xml:space="preserve">        ScienceReview[Scientific Review / Debate Agent]:::ai</w:t>
-        <w:br/>
-        <w:t xml:space="preserve">        Writer[Academic Writing Agent]:::ai</w:t>
-        <w:br/>
-        <w:t xml:space="preserve">        QA[QA &amp; Verification Agent]:::ai</w:t>
-        <w:br/>
-        <w:t xml:space="preserve">        Vision[Vision AI / Figure Analysis]:::ai</w:t>
-        <w:br/>
-        <w:t xml:space="preserve">    end</w:t>
-        <w:br/>
-        <w:br/>
-        <w:t xml:space="preserve">    %% Flow</w:t>
-        <w:br/>
-        <w:t xml:space="preserve">    Client --&gt;|HTTP Requests| API</w:t>
-        <w:br/>
-        <w:t xml:space="preserve">    API --&gt;|Triggers Background Jobs| Inngest</w:t>
-        <w:br/>
-        <w:t xml:space="preserve">    API &lt;--&gt;|Sync CRUD| DB</w:t>
-        <w:br/>
-        <w:t xml:space="preserve">    Inngest --&gt;|Manages Workflows| Orchestrator</w:t>
-        <w:br/>
-        <w:t xml:space="preserve">    Inngest &lt;--&gt;|Webhook Events| Stripe</w:t>
-        <w:br/>
-        <w:br/>
-        <w:t xml:space="preserve">    Orchestrator --&gt;|Delegates Tasks| Clarification</w:t>
-        <w:br/>
-        <w:t xml:space="preserve">    Orchestrator --&gt;|Delegates Tasks| Planning</w:t>
-        <w:br/>
-        <w:t xml:space="preserve">    Orchestrator --&gt;|Delegates Tasks| Knowledge</w:t>
-        <w:br/>
-        <w:t xml:space="preserve">    Orchestrator --&gt;|Delegates Tasks| ScienceReview</w:t>
-        <w:br/>
-        <w:t xml:space="preserve">    Orchestrator --&gt;|Delegates Tasks| Writer</w:t>
-        <w:br/>
-        <w:t xml:space="preserve">    Orchestrator --&gt;|Delegates Tasks| QA</w:t>
-        <w:br/>
-        <w:br/>
-        <w:t xml:space="preserve">    %% Data Flow</w:t>
-        <w:br/>
-        <w:t xml:space="preserve">    Multi-Agent System &lt;--&gt;|HTTP / Vercel AI SDK| OpenAI/Anthropic</w:t>
-        <w:br/>
-        <w:t xml:space="preserve">    Multi-Agent System &lt;--&gt;|Vector/Graph Search| DB</w:t>
-        <w:br/>
-        <w:t xml:space="preserve">    Multi-Agent System &lt;--&gt;|Save Stages/Versions| DB</w:t>
-        <w:br/>
-        <w:t xml:space="preserve">    Multi-Agent System --&gt;|Store Memory| Mem0</w:t>
-        <w:br/>
-        <w:t xml:space="preserve">    Multi-Agent System --&gt;|Telemetry| Langfuse</w:t>
-        <w:br/>
-        <w:t xml:space="preserve">    QA &lt;--&gt;|Execute Data Analysis| E2B</w:t>
-        <w:br/>
-        <w:t xml:space="preserve">    Vision &lt;--&gt;|Analyze Figures| E2B</w:t>
-        <w:br/>
-      </w:r>
-      <w:r/>
+      <w:r/>
+    </w:p>
+    <w:p>
+      <w:r>
+        <w:drawing>
+          <wp:inline xmlns:a="http://schemas.openxmlformats.org/drawingml/2006/main" xmlns:pic="http://schemas.openxmlformats.org/drawingml/2006/picture">
+            <wp:extent cx="9956800" cy="7797800"/>
+            <wp:docPr id="6" name="Picture 6"/>
+            <wp:cNvGraphicFramePr>
+              <a:graphicFrameLocks noChangeAspect="1"/>
+            </wp:cNvGraphicFramePr>
+            <a:graphic>
+              <a:graphicData uri="http://schemas.openxmlformats.org/drawingml/2006/picture">
+                <pic:pic>
+                  <pic:nvPicPr>
+                    <pic:cNvPr id="0" name="backend_analysis_diagram_1.png"/>
+                    <pic:cNvPicPr/>
+                  </pic:nvPicPr>
+                  <pic:blipFill>
+                    <a:blip r:embed="rId14"/>
+                    <a:stretch>
+                      <a:fillRect/>
+                    </a:stretch>
+                  </pic:blipFill>
+                  <pic:spPr>
+                    <a:xfrm>
+                      <a:off x="0" y="0"/>
+                      <a:ext cx="9956800" cy="7797800"/>
+                    </a:xfrm>
+                    <a:prstGeom prst="rect"/>
+                  </pic:spPr>
+                </pic:pic>
+              </a:graphicData>
+            </a:graphic>
+          </wp:inline>
+        </w:drawing>
+      </w:r>
     </w:p>
     <w:p>
       <w:pPr>
@@ -1540,65 +1440,43 @@
     </w:p>
     <w:p>
       <w:r/>
-      <w:r>
-        <w:rPr>
-          <w:rFonts w:ascii="Courier" w:hAnsi="Courier"/>
-        </w:rPr>
-        <w:t>sequenceDiagram</w:t>
-        <w:br/>
-        <w:t xml:space="preserve">    participant API as Next.js API</w:t>
-        <w:br/>
-        <w:t xml:space="preserve">    participant Inngest as Inngest Worker</w:t>
-        <w:br/>
-        <w:t xml:space="preserve">    participant DB as Neon Postgres DB</w:t>
-        <w:br/>
-        <w:t xml:space="preserve">    participant Agent as Specialized Agent (e.g. Planning)</w:t>
-        <w:br/>
-        <w:t xml:space="preserve">    participant LLM as OpenAI/Anthropic API</w:t>
-        <w:br/>
-        <w:br/>
-        <w:t xml:space="preserve">    API-&gt;&gt;Inngest: Trigger Workflow (e.g., generate-paper)</w:t>
-        <w:br/>
-        <w:t xml:space="preserve">    activate Inngest</w:t>
-        <w:br/>
-        <w:t xml:space="preserve">    Inngest-&gt;&gt;DB: Create stage record (status: in_progress)</w:t>
-        <w:br/>
-        <w:t xml:space="preserve">    DB--&gt;&gt;Inngest: Return stage ID</w:t>
-        <w:br/>
-        <w:br/>
-        <w:t xml:space="preserve">    Inngest-&gt;&gt;Agent: Execute agent logic</w:t>
-        <w:br/>
-        <w:t xml:space="preserve">    activate Agent</w:t>
-        <w:br/>
-        <w:t xml:space="preserve">    Agent-&gt;&gt;DB: Fetch context (RAG/memory)</w:t>
-        <w:br/>
-        <w:t xml:space="preserve">    DB--&gt;&gt;Agent: Context data</w:t>
-        <w:br/>
-        <w:t xml:space="preserve">    Agent-&gt;&gt;LLM: Execute prompt with tools</w:t>
-        <w:br/>
-        <w:t xml:space="preserve">    LLM--&gt;&gt;Agent: Structured output</w:t>
-        <w:br/>
-        <w:t xml:space="preserve">    Agent--&gt;&gt;Inngest: Return agent result</w:t>
-        <w:br/>
-        <w:t xml:space="preserve">    deactivate Agent</w:t>
-        <w:br/>
-        <w:br/>
-        <w:t xml:space="preserve">    alt Success</w:t>
-        <w:br/>
-        <w:t xml:space="preserve">        Inngest-&gt;&gt;DB: Update stage record (status: completed, save output)</w:t>
-        <w:br/>
-        <w:t xml:space="preserve">    else Failure</w:t>
-        <w:br/>
-        <w:t xml:space="preserve">        Inngest-&gt;&gt;DB: Update stage record (status: failed)</w:t>
-        <w:br/>
-        <w:t xml:space="preserve">        Inngest-&gt;&gt;Inngest: Schedule retry (idempotent)</w:t>
-        <w:br/>
-        <w:t xml:space="preserve">    end</w:t>
-        <w:br/>
-        <w:t xml:space="preserve">    deactivate Inngest</w:t>
-        <w:br/>
-      </w:r>
-      <w:r/>
+      <w:r/>
+    </w:p>
+    <w:p>
+      <w:r>
+        <w:drawing>
+          <wp:inline xmlns:a="http://schemas.openxmlformats.org/drawingml/2006/main" xmlns:pic="http://schemas.openxmlformats.org/drawingml/2006/picture">
+            <wp:extent cx="9956800" cy="5981700"/>
+            <wp:docPr id="7" name="Picture 7"/>
+            <wp:cNvGraphicFramePr>
+              <a:graphicFrameLocks noChangeAspect="1"/>
+            </wp:cNvGraphicFramePr>
+            <a:graphic>
+              <a:graphicData uri="http://schemas.openxmlformats.org/drawingml/2006/picture">
+                <pic:pic>
+                  <pic:nvPicPr>
+                    <pic:cNvPr id="0" name="backend_analysis_diagram_2.png"/>
+                    <pic:cNvPicPr/>
+                  </pic:nvPicPr>
+                  <pic:blipFill>
+                    <a:blip r:embed="rId15"/>
+                    <a:stretch>
+                      <a:fillRect/>
+                    </a:stretch>
+                  </pic:blipFill>
+                  <pic:spPr>
+                    <a:xfrm>
+                      <a:off x="0" y="0"/>
+                      <a:ext cx="9956800" cy="5981700"/>
+                    </a:xfrm>
+                    <a:prstGeom prst="rect"/>
+                  </pic:spPr>
+                </pic:pic>
+              </a:graphicData>
+            </a:graphic>
+          </wp:inline>
+        </w:drawing>
+      </w:r>
     </w:p>
     <w:p>
       <w:pPr>
@@ -1687,75 +1565,43 @@
     </w:p>
     <w:p>
       <w:r/>
-      <w:r>
-        <w:rPr>
-          <w:rFonts w:ascii="Courier" w:hAnsi="Courier"/>
-        </w:rPr>
-        <w:t>erDiagram</w:t>
-        <w:br/>
-        <w:t xml:space="preserve">    USERS ||--o{ PAPERS : creates</w:t>
-        <w:br/>
-        <w:t xml:space="preserve">    USERS ||--o{ ACCOUNTS : links</w:t>
-        <w:br/>
-        <w:t xml:space="preserve">    PAPERS ||--o{ PAPER_VERSIONS : has</w:t>
-        <w:br/>
-        <w:t xml:space="preserve">    PAPERS ||--o{ PAPER_STAGES : tracks</w:t>
-        <w:br/>
-        <w:t xml:space="preserve">    PAPERS ||--o{ FIGURES : contains</w:t>
-        <w:br/>
-        <w:t xml:space="preserve">    PAPER_STAGES ||--|| DEBATES : initiates</w:t>
-        <w:br/>
-        <w:t xml:space="preserve">    DEBATES ||--o{ DEBATE_MESSAGES : contains</w:t>
-        <w:br/>
-        <w:t xml:space="preserve">    DEBATES ||--o{ DEBATE_AGENTS : involves</w:t>
-        <w:br/>
-        <w:t xml:space="preserve">    DOCUMENTS ||--o{ DOCUMENT_CHUNKS : split_into</w:t>
-        <w:br/>
-        <w:t xml:space="preserve">    DOCUMENT_CHUNKS {</w:t>
-        <w:br/>
-        <w:t xml:space="preserve">        vector embedding</w:t>
-        <w:br/>
-        <w:t xml:space="preserve">        text content</w:t>
-        <w:br/>
-        <w:t xml:space="preserve">    }</w:t>
-        <w:br/>
-        <w:t xml:space="preserve">    PAPERS ||--o{ SANDBOX_RUNS : spawns</w:t>
-        <w:br/>
-        <w:t xml:space="preserve">    SANDBOX_RUNS ||--o{ GENERATED_CHARTS : produces</w:t>
-        <w:br/>
-        <w:br/>
-        <w:t xml:space="preserve">    USERS {</w:t>
-        <w:br/>
-        <w:t xml:space="preserve">        uuid id PK</w:t>
-        <w:br/>
-        <w:t xml:space="preserve">        string email</w:t>
-        <w:br/>
-        <w:t xml:space="preserve">    }</w:t>
-        <w:br/>
-        <w:t xml:space="preserve">    PAPERS {</w:t>
-        <w:br/>
-        <w:t xml:space="preserve">        int id PK</w:t>
-        <w:br/>
-        <w:t xml:space="preserve">        uuid userId FK</w:t>
-        <w:br/>
-        <w:t xml:space="preserve">        string title</w:t>
-        <w:br/>
-        <w:t xml:space="preserve">    }</w:t>
-        <w:br/>
-        <w:t xml:space="preserve">    PAPER_STAGES {</w:t>
-        <w:br/>
-        <w:t xml:space="preserve">        int id PK</w:t>
-        <w:br/>
-        <w:t xml:space="preserve">        int paperId FK</w:t>
-        <w:br/>
-        <w:t xml:space="preserve">        string stage_name</w:t>
-        <w:br/>
-        <w:t xml:space="preserve">        string status</w:t>
-        <w:br/>
-        <w:t xml:space="preserve">    }</w:t>
-        <w:br/>
-      </w:r>
-      <w:r/>
+      <w:r/>
+    </w:p>
+    <w:p>
+      <w:r>
+        <w:drawing>
+          <wp:inline xmlns:a="http://schemas.openxmlformats.org/drawingml/2006/main" xmlns:pic="http://schemas.openxmlformats.org/drawingml/2006/picture">
+            <wp:extent cx="9956800" cy="12484100"/>
+            <wp:docPr id="8" name="Picture 8"/>
+            <wp:cNvGraphicFramePr>
+              <a:graphicFrameLocks noChangeAspect="1"/>
+            </wp:cNvGraphicFramePr>
+            <a:graphic>
+              <a:graphicData uri="http://schemas.openxmlformats.org/drawingml/2006/picture">
+                <pic:pic>
+                  <pic:nvPicPr>
+                    <pic:cNvPr id="0" name="backend_analysis_diagram_3.png"/>
+                    <pic:cNvPicPr/>
+                  </pic:nvPicPr>
+                  <pic:blipFill>
+                    <a:blip r:embed="rId16"/>
+                    <a:stretch>
+                      <a:fillRect/>
+                    </a:stretch>
+                  </pic:blipFill>
+                  <pic:spPr>
+                    <a:xfrm>
+                      <a:off x="0" y="0"/>
+                      <a:ext cx="9956800" cy="12484100"/>
+                    </a:xfrm>
+                    <a:prstGeom prst="rect"/>
+                  </pic:spPr>
+                </pic:pic>
+              </a:graphicData>
+            </a:graphic>
+          </wp:inline>
+        </w:drawing>
+      </w:r>
     </w:p>
     <w:p>
       <w:pPr>
@@ -1810,42 +1656,43 @@
     </w:p>
     <w:p>
       <w:r/>
-      <w:r>
-        <w:rPr>
-          <w:rFonts w:ascii="Courier" w:hAnsi="Courier"/>
-        </w:rPr>
-        <w:t>flowchart LR</w:t>
-        <w:br/>
-        <w:t xml:space="preserve">    Client([Frontend Client]) --&gt;|POST /api/ai/generate| API[Next.js API Route]</w:t>
-        <w:br/>
-        <w:t xml:space="preserve">    Client --&gt;|POST /api/submissions/:id/submit| API</w:t>
-        <w:br/>
-        <w:br/>
-        <w:t xml:space="preserve">    subgraph Synchronous</w:t>
-        <w:br/>
-        <w:t xml:space="preserve">        API --&gt;|Fetch Context| DB[(Neon DB)]</w:t>
-        <w:br/>
-        <w:t xml:space="preserve">        API --&gt;|Format Prompt| Schema[Zod Patch Schema]</w:t>
-        <w:br/>
-        <w:t xml:space="preserve">        Schema --&gt;|Stream Result| LLM[LLM API]</w:t>
-        <w:br/>
-        <w:t xml:space="preserve">        LLM -.-&gt;|Streamed JSON| Client</w:t>
-        <w:br/>
-        <w:t xml:space="preserve">    end</w:t>
-        <w:br/>
-        <w:br/>
-        <w:t xml:space="preserve">    subgraph Asynchronous</w:t>
-        <w:br/>
-        <w:t xml:space="preserve">        API --&gt;|Trigger Event| InngestQueue((Inngest Event Queue))</w:t>
-        <w:br/>
-        <w:t xml:space="preserve">        InngestQueue --&gt;|submission/process| RPAWorker[RPA Background Worker]</w:t>
-        <w:br/>
-        <w:t xml:space="preserve">        RPAWorker --&gt;|Execute long-running submission| External[External Journal Platform]</w:t>
-        <w:br/>
-        <w:t xml:space="preserve">    end</w:t>
-        <w:br/>
-      </w:r>
-      <w:r/>
+      <w:r/>
+    </w:p>
+    <w:p>
+      <w:r>
+        <w:drawing>
+          <wp:inline xmlns:a="http://schemas.openxmlformats.org/drawingml/2006/main" xmlns:pic="http://schemas.openxmlformats.org/drawingml/2006/picture">
+            <wp:extent cx="9956800" cy="1638300"/>
+            <wp:docPr id="9" name="Picture 9"/>
+            <wp:cNvGraphicFramePr>
+              <a:graphicFrameLocks noChangeAspect="1"/>
+            </wp:cNvGraphicFramePr>
+            <a:graphic>
+              <a:graphicData uri="http://schemas.openxmlformats.org/drawingml/2006/picture">
+                <pic:pic>
+                  <pic:nvPicPr>
+                    <pic:cNvPr id="0" name="backend_analysis_diagram_4.png"/>
+                    <pic:cNvPicPr/>
+                  </pic:nvPicPr>
+                  <pic:blipFill>
+                    <a:blip r:embed="rId17"/>
+                    <a:stretch>
+                      <a:fillRect/>
+                    </a:stretch>
+                  </pic:blipFill>
+                  <pic:spPr>
+                    <a:xfrm>
+                      <a:off x="0" y="0"/>
+                      <a:ext cx="9956800" cy="1638300"/>
+                    </a:xfrm>
+                    <a:prstGeom prst="rect"/>
+                  </pic:spPr>
+                </pic:pic>
+              </a:graphicData>
+            </a:graphic>
+          </wp:inline>
+        </w:drawing>
+      </w:r>
     </w:p>
     <w:p>
       <w:pPr>
@@ -2134,50 +1981,43 @@
     </w:p>
     <w:p>
       <w:r/>
-      <w:r>
-        <w:rPr>
-          <w:rFonts w:ascii="Courier" w:hAnsi="Courier"/>
-        </w:rPr>
-        <w:t>flowchart TD</w:t>
-        <w:br/>
-        <w:t xml:space="preserve">    classDef trigger fill:#D1D5DB,stroke:#374151</w:t>
-        <w:br/>
-        <w:t xml:space="preserve">    classDef inngest fill:#F3F4F6,stroke:#D1D5DB</w:t>
-        <w:br/>
-        <w:t xml:space="preserve">    classDef ai fill:#FEF3C7,stroke:#F59E0B</w:t>
-        <w:br/>
-        <w:br/>
-        <w:t xml:space="preserve">    subgraph "Inngest Event Workflows"</w:t>
-        <w:br/>
-        <w:t xml:space="preserve">        Upload[Paper Uploaded Event]:::trigger</w:t>
-        <w:br/>
-        <w:t xml:space="preserve">        ReviewComments[Reviewer Comments Event]:::trigger</w:t>
-        <w:br/>
-        <w:t xml:space="preserve">        Schedule[Weekly Cron Schedule]:::trigger</w:t>
-        <w:br/>
-        <w:br/>
-        <w:t xml:space="preserve">        Upload --&gt; UploadWorkflow[processPaperUploaded\nExtraction -&gt; Review -&gt; QA -&gt; Compiling]:::inngest</w:t>
-        <w:br/>
-        <w:t xml:space="preserve">        ReviewComments --&gt; ResubWorkflow[processResubmission\nRebuttal Agent Strategy]:::inngest</w:t>
-        <w:br/>
-        <w:t xml:space="preserve">        Schedule --&gt; DigestWorkflow[sendWeeklyDigest\nEmail Users]:::inngest</w:t>
-        <w:br/>
-        <w:br/>
-        <w:t xml:space="preserve">        UploadWorkflow --&gt; Router[AI Router\nModel Selection]:::inngest</w:t>
-        <w:br/>
-        <w:t xml:space="preserve">        ResubWorkflow --&gt; Router</w:t>
-        <w:br/>
-        <w:br/>
-        <w:t xml:space="preserve">        Router --&gt; Opus[Claude 3 Opus\nHeavy Reasoning]:::ai</w:t>
-        <w:br/>
-        <w:t xml:space="preserve">        Router --&gt; Sonnet[Claude 3.7 Sonnet\nInteractive Tasks]:::ai</w:t>
-        <w:br/>
-        <w:t xml:space="preserve">        Router --&gt; GPT[GPT-4o\nFallback]:::ai</w:t>
-        <w:br/>
-        <w:t xml:space="preserve">    end</w:t>
-        <w:br/>
-      </w:r>
-      <w:r/>
+      <w:r/>
+    </w:p>
+    <w:p>
+      <w:r>
+        <w:drawing>
+          <wp:inline xmlns:a="http://schemas.openxmlformats.org/drawingml/2006/main" xmlns:pic="http://schemas.openxmlformats.org/drawingml/2006/picture">
+            <wp:extent cx="8839200" cy="7099300"/>
+            <wp:docPr id="10" name="Picture 10"/>
+            <wp:cNvGraphicFramePr>
+              <a:graphicFrameLocks noChangeAspect="1"/>
+            </wp:cNvGraphicFramePr>
+            <a:graphic>
+              <a:graphicData uri="http://schemas.openxmlformats.org/drawingml/2006/picture">
+                <pic:pic>
+                  <pic:nvPicPr>
+                    <pic:cNvPr id="0" name="integrations_analysis_diagram_1.png"/>
+                    <pic:cNvPicPr/>
+                  </pic:nvPicPr>
+                  <pic:blipFill>
+                    <a:blip r:embed="rId18"/>
+                    <a:stretch>
+                      <a:fillRect/>
+                    </a:stretch>
+                  </pic:blipFill>
+                  <pic:spPr>
+                    <a:xfrm>
+                      <a:off x="0" y="0"/>
+                      <a:ext cx="8839200" cy="7099300"/>
+                    </a:xfrm>
+                    <a:prstGeom prst="rect"/>
+                  </pic:spPr>
+                </pic:pic>
+              </a:graphicData>
+            </a:graphic>
+          </wp:inline>
+        </w:drawing>
+      </w:r>
     </w:p>
     <w:p>
       <w:pPr>
@@ -2327,58 +2167,43 @@
     </w:p>
     <w:p>
       <w:r/>
-      <w:r>
-        <w:rPr>
-          <w:rFonts w:ascii="Courier" w:hAnsi="Courier"/>
-        </w:rPr>
-        <w:t>sequenceDiagram</w:t>
-        <w:br/>
-        <w:t xml:space="preserve">    participant Agent as AI Agent (Client)</w:t>
-        <w:br/>
-        <w:t xml:space="preserve">    participant NextJS as Next.js SSE Endpoint</w:t>
-        <w:br/>
-        <w:t xml:space="preserve">    participant Registry as Session &amp; Auth</w:t>
-        <w:br/>
-        <w:t xml:space="preserve">    participant Resolver as SSRF Connection Resolver</w:t>
-        <w:br/>
-        <w:t xml:space="preserve">    participant Tool as MCP Tool (WP/OJS/Lit)</w:t>
-        <w:br/>
-        <w:t xml:space="preserve">    participant External as External API</w:t>
-        <w:br/>
-        <w:br/>
-        <w:t xml:space="preserve">    Agent-&gt;&gt;NextJS: Initiate SSE Connection</w:t>
-        <w:br/>
-        <w:t xml:space="preserve">    NextJS-&gt;&gt;Registry: Validate Token / Session</w:t>
-        <w:br/>
-        <w:t xml:space="preserve">    Registry--&gt;&gt;NextJS: Authorized</w:t>
-        <w:br/>
-        <w:t xml:space="preserve">    Agent-&gt;&gt;NextJS: Execute Tool (e.g., create_wp_draft)</w:t>
-        <w:br/>
-        <w:t xml:space="preserve">    NextJS-&gt;&gt;Resolver: Validate Target URL (SSRF Check)</w:t>
-        <w:br/>
-        <w:br/>
-        <w:t xml:space="preserve">    alt URL is Safe</w:t>
-        <w:br/>
-        <w:t xml:space="preserve">        Resolver--&gt;&gt;NextJS: Validation Passed</w:t>
-        <w:br/>
-        <w:t xml:space="preserve">        NextJS-&gt;&gt;Tool: Execute Logic (Payload Formatting)</w:t>
-        <w:br/>
-        <w:t xml:space="preserve">        Tool-&gt;&gt;External: API Request (e.g., WordPress API)</w:t>
-        <w:br/>
-        <w:t xml:space="preserve">        External--&gt;&gt;Tool: Success (Confirmation ID / URL)</w:t>
-        <w:br/>
-        <w:t xml:space="preserve">        Tool--&gt;&gt;Agent: MCP Success Response</w:t>
-        <w:br/>
-        <w:t xml:space="preserve">    else URL is Unsafe</w:t>
-        <w:br/>
-        <w:t xml:space="preserve">        Resolver--&gt;&gt;NextJS: Validation Failed</w:t>
-        <w:br/>
-        <w:t xml:space="preserve">        NextJS--&gt;&gt;Agent: MCP Error (Blocked Target)</w:t>
-        <w:br/>
-        <w:t xml:space="preserve">    end</w:t>
-        <w:br/>
-      </w:r>
-      <w:r/>
+      <w:r/>
+    </w:p>
+    <w:p>
+      <w:r>
+        <w:drawing>
+          <wp:inline xmlns:a="http://schemas.openxmlformats.org/drawingml/2006/main" xmlns:pic="http://schemas.openxmlformats.org/drawingml/2006/picture">
+            <wp:extent cx="9956800" cy="5486400"/>
+            <wp:docPr id="11" name="Picture 11"/>
+            <wp:cNvGraphicFramePr>
+              <a:graphicFrameLocks noChangeAspect="1"/>
+            </wp:cNvGraphicFramePr>
+            <a:graphic>
+              <a:graphicData uri="http://schemas.openxmlformats.org/drawingml/2006/picture">
+                <pic:pic>
+                  <pic:nvPicPr>
+                    <pic:cNvPr id="0" name="integrations_analysis_diagram_2.png"/>
+                    <pic:cNvPicPr/>
+                  </pic:nvPicPr>
+                  <pic:blipFill>
+                    <a:blip r:embed="rId19"/>
+                    <a:stretch>
+                      <a:fillRect/>
+                    </a:stretch>
+                  </pic:blipFill>
+                  <pic:spPr>
+                    <a:xfrm>
+                      <a:off x="0" y="0"/>
+                      <a:ext cx="9956800" cy="5486400"/>
+                    </a:xfrm>
+                    <a:prstGeom prst="rect"/>
+                  </pic:spPr>
+                </pic:pic>
+              </a:graphicData>
+            </a:graphic>
+          </wp:inline>
+        </w:drawing>
+      </w:r>
     </w:p>
     <w:p>
       <w:pPr>
@@ -2479,51 +2304,43 @@
     </w:p>
     <w:p>
       <w:r/>
-      <w:r>
-        <w:rPr>
-          <w:rFonts w:ascii="Courier" w:hAnsi="Courier"/>
-        </w:rPr>
-        <w:t>flowchart LR</w:t>
-        <w:br/>
-        <w:t xml:space="preserve">    classDef request fill:#E5E7EB,stroke:#9CA3AF</w:t>
-        <w:br/>
-        <w:t xml:space="preserve">    classDef check fill:#BFDBFE,stroke:#3B82F6</w:t>
-        <w:br/>
-        <w:t xml:space="preserve">    classDef pass fill:#BBF7D0,stroke:#22C55E</w:t>
-        <w:br/>
-        <w:t xml:space="preserve">    classDef fail fill:#FECACA,stroke:#EF4444</w:t>
-        <w:br/>
-        <w:br/>
-        <w:t xml:space="preserve">    Payload[Validation Request\nCode or Text]:::request --&gt; Branch{Action Type?}</w:t>
-        <w:br/>
-        <w:br/>
-        <w:t xml:space="preserve">    Branch --&gt;|code_execution| AST[AST Static Analysis]:::check</w:t>
-        <w:br/>
-        <w:t xml:space="preserve">    AST --&gt; CheckLoop(Infinite Loops?)</w:t>
-        <w:br/>
-        <w:t xml:space="preserve">    AST --&gt; CheckImports(System Imports?)</w:t>
-        <w:br/>
-        <w:t xml:space="preserve">    AST --&gt; CheckFunc(Eval/Exec/Open?)</w:t>
-        <w:br/>
-        <w:br/>
-        <w:t xml:space="preserve">    Branch --&gt;|academic_text| Regex[Text Pattern Matching]:::check</w:t>
-        <w:br/>
-        <w:t xml:space="preserve">    Regex --&gt; CheckAIApology(AI Apologies?)</w:t>
-        <w:br/>
-        <w:t xml:space="preserve">    Regex --&gt; CheckPlaceholders(Unresolved Placeholders?)</w:t>
-        <w:br/>
-        <w:br/>
-        <w:t xml:space="preserve">    CheckLoop &amp; CheckImports &amp; CheckFunc --&gt; |Violated| FailNode[Return Error/Fail]:::fail</w:t>
-        <w:br/>
-        <w:t xml:space="preserve">    CheckAIApology &amp; CheckPlaceholders --&gt; |Violated| FailNode</w:t>
-        <w:br/>
-        <w:br/>
-        <w:t xml:space="preserve">    CheckLoop &amp; CheckImports &amp; CheckFunc --&gt; |Safe| PassNode[Return Success]:::pass</w:t>
-        <w:br/>
-        <w:t xml:space="preserve">    CheckAIApology &amp; CheckPlaceholders --&gt; |Safe| PassNode</w:t>
-        <w:br/>
-      </w:r>
-      <w:r/>
+      <w:r/>
+    </w:p>
+    <w:p>
+      <w:r>
+        <w:drawing>
+          <wp:inline xmlns:a="http://schemas.openxmlformats.org/drawingml/2006/main" xmlns:pic="http://schemas.openxmlformats.org/drawingml/2006/picture">
+            <wp:extent cx="9956800" cy="3810000"/>
+            <wp:docPr id="12" name="Picture 12"/>
+            <wp:cNvGraphicFramePr>
+              <a:graphicFrameLocks noChangeAspect="1"/>
+            </wp:cNvGraphicFramePr>
+            <a:graphic>
+              <a:graphicData uri="http://schemas.openxmlformats.org/drawingml/2006/picture">
+                <pic:pic>
+                  <pic:nvPicPr>
+                    <pic:cNvPr id="0" name="integrations_analysis_diagram_3.png"/>
+                    <pic:cNvPicPr/>
+                  </pic:nvPicPr>
+                  <pic:blipFill>
+                    <a:blip r:embed="rId20"/>
+                    <a:stretch>
+                      <a:fillRect/>
+                    </a:stretch>
+                  </pic:blipFill>
+                  <pic:spPr>
+                    <a:xfrm>
+                      <a:off x="0" y="0"/>
+                      <a:ext cx="9956800" cy="3810000"/>
+                    </a:xfrm>
+                    <a:prstGeom prst="rect"/>
+                  </pic:spPr>
+                </pic:pic>
+              </a:graphicData>
+            </a:graphic>
+          </wp:inline>
+        </w:drawing>
+      </w:r>
     </w:p>
     <w:p>
       <w:pPr>
@@ -2536,48 +2353,43 @@
     </w:p>
     <w:p>
       <w:r/>
-      <w:r>
-        <w:rPr>
-          <w:rFonts w:ascii="Courier" w:hAnsi="Courier"/>
-        </w:rPr>
-        <w:t>sequenceDiagram</w:t>
-        <w:br/>
-        <w:t xml:space="preserve">    participant NextJS as Web App</w:t>
-        <w:br/>
-        <w:t xml:space="preserve">    participant Inngest as Inngest (Event Hub)</w:t>
-        <w:br/>
-        <w:t xml:space="preserve">    participant E2B as E2B Sandbox</w:t>
-        <w:br/>
-        <w:t xml:space="preserve">    participant Guardrails as Guardrails FastAPI</w:t>
-        <w:br/>
-        <w:br/>
-        <w:t xml:space="preserve">    NextJS-&gt;&gt;Inngest: Send paper/preflight event (Code Payload)</w:t>
-        <w:br/>
-        <w:t xml:space="preserve">    Inngest-&gt;&gt;Guardrails: POST /validate (action: code_execution)</w:t>
-        <w:br/>
-        <w:br/>
-        <w:t xml:space="preserve">    alt Guardrails Validation Fails</w:t>
-        <w:br/>
-        <w:t xml:space="preserve">        Guardrails--&gt;&gt;Inngest: Fail (e.g., destructive imports)</w:t>
-        <w:br/>
-        <w:t xml:space="preserve">        Inngest-&gt;&gt;NextJS: Fire paper.preflight.failed</w:t>
-        <w:br/>
-        <w:t xml:space="preserve">    else Guardrails Validation Succeeds</w:t>
-        <w:br/>
-        <w:t xml:space="preserve">        Guardrails--&gt;&gt;Inngest: Pass</w:t>
-        <w:br/>
-        <w:t xml:space="preserve">        Inngest-&gt;&gt;E2B: Spin up publish-ai-data-science template</w:t>
-        <w:br/>
-        <w:t xml:space="preserve">        E2B-&gt;&gt;E2B: Execute Code</w:t>
-        <w:br/>
-        <w:t xml:space="preserve">        E2B--&gt;&gt;Inngest: Return results/stdout</w:t>
-        <w:br/>
-        <w:t xml:space="preserve">        Inngest-&gt;&gt;NextJS: Fire paper.preflight.success</w:t>
-        <w:br/>
-        <w:t xml:space="preserve">    end</w:t>
-        <w:br/>
-      </w:r>
-      <w:r/>
+      <w:r/>
+    </w:p>
+    <w:p>
+      <w:r>
+        <w:drawing>
+          <wp:inline xmlns:a="http://schemas.openxmlformats.org/drawingml/2006/main" xmlns:pic="http://schemas.openxmlformats.org/drawingml/2006/picture">
+            <wp:extent cx="9956800" cy="6578600"/>
+            <wp:docPr id="13" name="Picture 13"/>
+            <wp:cNvGraphicFramePr>
+              <a:graphicFrameLocks noChangeAspect="1"/>
+            </wp:cNvGraphicFramePr>
+            <a:graphic>
+              <a:graphicData uri="http://schemas.openxmlformats.org/drawingml/2006/picture">
+                <pic:pic>
+                  <pic:nvPicPr>
+                    <pic:cNvPr id="0" name="integrations_analysis_diagram_4.png"/>
+                    <pic:cNvPicPr/>
+                  </pic:nvPicPr>
+                  <pic:blipFill>
+                    <a:blip r:embed="rId21"/>
+                    <a:stretch>
+                      <a:fillRect/>
+                    </a:stretch>
+                  </pic:blipFill>
+                  <pic:spPr>
+                    <a:xfrm>
+                      <a:off x="0" y="0"/>
+                      <a:ext cx="9956800" cy="6578600"/>
+                    </a:xfrm>
+                    <a:prstGeom prst="rect"/>
+                  </pic:spPr>
+                </pic:pic>
+              </a:graphicData>
+            </a:graphic>
+          </wp:inline>
+        </w:drawing>
+      </w:r>
     </w:p>
     <w:p>
       <w:pPr>
@@ -2935,30 +2747,43 @@
     </w:p>
     <w:p>
       <w:r/>
-      <w:r>
-        <w:rPr>
-          <w:rFonts w:ascii="Courier" w:hAnsi="Courier"/>
-        </w:rPr>
-        <w:t>flowchart TD</w:t>
-        <w:br/>
-        <w:t xml:space="preserve">    A[Push / Pull Request on main/master] --&gt; B(GitHub Actions: Node.js Test Job)</w:t>
-        <w:br/>
-        <w:t xml:space="preserve">    B --&gt; C[Checkout repository]</w:t>
-        <w:br/>
-        <w:t xml:space="preserve">    C --&gt; D[Set up Node.js 20.x]</w:t>
-        <w:br/>
-        <w:t xml:space="preserve">    D --&gt; E[Install dependencies: npm ci]</w:t>
-        <w:br/>
-        <w:t xml:space="preserve">    E --&gt; F[Run linter: npm run lint]</w:t>
-        <w:br/>
-        <w:t xml:space="preserve">    F --&gt; G[Run unit/integration tests: npm test]</w:t>
-        <w:br/>
-        <w:t xml:space="preserve">    G --&gt; H[Install Playwright Browsers]</w:t>
-        <w:br/>
-        <w:t xml:space="preserve">    H --&gt; I[Run E2E tests: npm run test:e2e]</w:t>
-        <w:br/>
-      </w:r>
-      <w:r/>
+      <w:r/>
+    </w:p>
+    <w:p>
+      <w:r>
+        <w:drawing>
+          <wp:inline xmlns:a="http://schemas.openxmlformats.org/drawingml/2006/main" xmlns:pic="http://schemas.openxmlformats.org/drawingml/2006/picture">
+            <wp:extent cx="2133600" cy="13220700"/>
+            <wp:docPr id="14" name="Picture 14"/>
+            <wp:cNvGraphicFramePr>
+              <a:graphicFrameLocks noChangeAspect="1"/>
+            </wp:cNvGraphicFramePr>
+            <a:graphic>
+              <a:graphicData uri="http://schemas.openxmlformats.org/drawingml/2006/picture">
+                <pic:pic>
+                  <pic:nvPicPr>
+                    <pic:cNvPr id="0" name="devops_analysis_diagram_1.png"/>
+                    <pic:cNvPicPr/>
+                  </pic:nvPicPr>
+                  <pic:blipFill>
+                    <a:blip r:embed="rId22"/>
+                    <a:stretch>
+                      <a:fillRect/>
+                    </a:stretch>
+                  </pic:blipFill>
+                  <pic:spPr>
+                    <a:xfrm>
+                      <a:off x="0" y="0"/>
+                      <a:ext cx="2133600" cy="13220700"/>
+                    </a:xfrm>
+                    <a:prstGeom prst="rect"/>
+                  </pic:spPr>
+                </pic:pic>
+              </a:graphicData>
+            </a:graphic>
+          </wp:inline>
+        </w:drawing>
+      </w:r>
     </w:p>
     <w:p>
       <w:r/>
@@ -3062,39 +2887,43 @@
     </w:p>
     <w:p>
       <w:r/>
-      <w:r>
-        <w:rPr>
-          <w:rFonts w:ascii="Courier" w:hAnsi="Courier"/>
-        </w:rPr>
-        <w:t>flowchart LR</w:t>
-        <w:br/>
-        <w:t xml:space="preserve">    subgraph Testing Architecture</w:t>
-        <w:br/>
-        <w:t xml:space="preserve">        direction TB</w:t>
-        <w:br/>
-        <w:t xml:space="preserve">        A(Test Suites) --&gt; B[Jest Framework]</w:t>
-        <w:br/>
-        <w:t xml:space="preserve">        A --&gt; C[Playwright Framework]</w:t>
-        <w:br/>
-        <w:br/>
-        <w:t xml:space="preserve">        B --&gt; D[Unit Tests: src/__tests__]</w:t>
-        <w:br/>
-        <w:t xml:space="preserve">        B --&gt; E[Integration Tests: __tests__]</w:t>
-        <w:br/>
-        <w:br/>
-        <w:t xml:space="preserve">        C --&gt; F[End-to-End Tests: ./e2e]</w:t>
-        <w:br/>
-        <w:br/>
-        <w:t xml:space="preserve">        D -. Mocked Environment .-&gt; G((JSDOM + Dummy Env Vars))</w:t>
-        <w:br/>
-        <w:t xml:space="preserve">        E -. Mocked Environment .-&gt; G</w:t>
-        <w:br/>
-        <w:t xml:space="preserve">        F -. Isolated Chrome .-&gt; H((Local Next.js Server))</w:t>
-        <w:br/>
-        <w:t xml:space="preserve">    end</w:t>
-        <w:br/>
-      </w:r>
-      <w:r/>
+      <w:r/>
+    </w:p>
+    <w:p>
+      <w:r>
+        <w:drawing>
+          <wp:inline xmlns:a="http://schemas.openxmlformats.org/drawingml/2006/main" xmlns:pic="http://schemas.openxmlformats.org/drawingml/2006/picture">
+            <wp:extent cx="8191500" cy="8737600"/>
+            <wp:docPr id="15" name="Picture 15"/>
+            <wp:cNvGraphicFramePr>
+              <a:graphicFrameLocks noChangeAspect="1"/>
+            </wp:cNvGraphicFramePr>
+            <a:graphic>
+              <a:graphicData uri="http://schemas.openxmlformats.org/drawingml/2006/picture">
+                <pic:pic>
+                  <pic:nvPicPr>
+                    <pic:cNvPr id="0" name="devops_analysis_diagram_2.png"/>
+                    <pic:cNvPicPr/>
+                  </pic:nvPicPr>
+                  <pic:blipFill>
+                    <a:blip r:embed="rId23"/>
+                    <a:stretch>
+                      <a:fillRect/>
+                    </a:stretch>
+                  </pic:blipFill>
+                  <pic:spPr>
+                    <a:xfrm>
+                      <a:off x="0" y="0"/>
+                      <a:ext cx="8191500" cy="8737600"/>
+                    </a:xfrm>
+                    <a:prstGeom prst="rect"/>
+                  </pic:spPr>
+                </pic:pic>
+              </a:graphicData>
+            </a:graphic>
+          </wp:inline>
+        </w:drawing>
+      </w:r>
     </w:p>
     <w:p>
       <w:pPr>
@@ -3564,31 +3393,43 @@
     </w:p>
     <w:p>
       <w:r/>
-      <w:r>
-        <w:rPr>
-          <w:rFonts w:ascii="Courier" w:hAnsi="Courier"/>
-        </w:rPr>
-        <w:t>stateDiagram-v2</w:t>
-        <w:br/>
-        <w:t xml:space="preserve">    [*] --&gt; DeterminePaperId: Start QA Runner Script</w:t>
-        <w:br/>
-        <w:t xml:space="preserve">    DeterminePaperId --&gt; GeneratePayload: Create Paper ID (Env Override or Random)</w:t>
-        <w:br/>
-        <w:t xml:space="preserve">    GeneratePayload --&gt; TriggerInngest: Generate 50+ Page Text (~248k chars)</w:t>
-        <w:br/>
-        <w:t xml:space="preserve">    TriggerInngest --&gt; DispatchSuccess: Dispatch 'paper/uploaded' Event</w:t>
-        <w:br/>
-        <w:t xml:space="preserve">    TriggerInngest --&gt; ErrorHandling: Network or Inngest Failure</w:t>
-        <w:br/>
-        <w:br/>
-        <w:t xml:space="preserve">    DispatchSuccess --&gt; [*]</w:t>
-        <w:br/>
-        <w:t xml:space="preserve">    ErrorHandling --&gt; HintDevServer: Log Missing Inngest Dev Server</w:t>
-        <w:br/>
-        <w:t xml:space="preserve">    HintDevServer --&gt; [*]</w:t>
-        <w:br/>
-      </w:r>
-      <w:r/>
+      <w:r/>
+    </w:p>
+    <w:p>
+      <w:r>
+        <w:drawing>
+          <wp:inline xmlns:a="http://schemas.openxmlformats.org/drawingml/2006/main" xmlns:pic="http://schemas.openxmlformats.org/drawingml/2006/picture">
+            <wp:extent cx="5473700" cy="11150600"/>
+            <wp:docPr id="16" name="Picture 16"/>
+            <wp:cNvGraphicFramePr>
+              <a:graphicFrameLocks noChangeAspect="1"/>
+            </wp:cNvGraphicFramePr>
+            <a:graphic>
+              <a:graphicData uri="http://schemas.openxmlformats.org/drawingml/2006/picture">
+                <pic:pic>
+                  <pic:nvPicPr>
+                    <pic:cNvPr id="0" name="devops_analysis_diagram_3.png"/>
+                    <pic:cNvPicPr/>
+                  </pic:nvPicPr>
+                  <pic:blipFill>
+                    <a:blip r:embed="rId24"/>
+                    <a:stretch>
+                      <a:fillRect/>
+                    </a:stretch>
+                  </pic:blipFill>
+                  <pic:spPr>
+                    <a:xfrm>
+                      <a:off x="0" y="0"/>
+                      <a:ext cx="5473700" cy="11150600"/>
+                    </a:xfrm>
+                    <a:prstGeom prst="rect"/>
+                  </pic:spPr>
+                </pic:pic>
+              </a:graphicData>
+            </a:graphic>
+          </wp:inline>
+        </w:drawing>
+      </w:r>
     </w:p>
     <w:p>
       <w:pPr>

</xml_diff>

<commit_message>
docs: increase diagram resolution and fix layout in onboarding doc
</commit_message>
<xml_diff>
--- a/PublishAI_Onboarding.docx
+++ b/PublishAI_Onboarding.docx
@@ -342,7 +342,7 @@
       <w:r>
         <w:drawing>
           <wp:inline xmlns:a="http://schemas.openxmlformats.org/drawingml/2006/main" xmlns:pic="http://schemas.openxmlformats.org/drawingml/2006/picture">
-            <wp:extent cx="5626100" cy="11671300"/>
+            <wp:extent cx="22504400" cy="46685200"/>
             <wp:docPr id="1" name="Picture 1"/>
             <wp:cNvGraphicFramePr>
               <a:graphicFrameLocks noChangeAspect="1"/>
@@ -363,7 +363,7 @@
                   <pic:spPr>
                     <a:xfrm>
                       <a:off x="0" y="0"/>
-                      <a:ext cx="5626100" cy="11671300"/>
+                      <a:ext cx="22504400" cy="46685200"/>
                     </a:xfrm>
                     <a:prstGeom prst="rect"/>
                   </pic:spPr>
@@ -619,7 +619,7 @@
       <w:r>
         <w:drawing>
           <wp:inline xmlns:a="http://schemas.openxmlformats.org/drawingml/2006/main" xmlns:pic="http://schemas.openxmlformats.org/drawingml/2006/picture">
-            <wp:extent cx="9956800" cy="6819900"/>
+            <wp:extent cx="39827200" cy="27279600"/>
             <wp:docPr id="2" name="Picture 2"/>
             <wp:cNvGraphicFramePr>
               <a:graphicFrameLocks noChangeAspect="1"/>
@@ -640,7 +640,7 @@
                   <pic:spPr>
                     <a:xfrm>
                       <a:off x="0" y="0"/>
-                      <a:ext cx="9956800" cy="6819900"/>
+                      <a:ext cx="39827200" cy="27279600"/>
                     </a:xfrm>
                     <a:prstGeom prst="rect"/>
                   </pic:spPr>
@@ -803,7 +803,7 @@
       <w:r>
         <w:drawing>
           <wp:inline xmlns:a="http://schemas.openxmlformats.org/drawingml/2006/main" xmlns:pic="http://schemas.openxmlformats.org/drawingml/2006/picture">
-            <wp:extent cx="9956800" cy="2819400"/>
+            <wp:extent cx="39827200" cy="11277600"/>
             <wp:docPr id="3" name="Picture 3"/>
             <wp:cNvGraphicFramePr>
               <a:graphicFrameLocks noChangeAspect="1"/>
@@ -824,7 +824,7 @@
                   <pic:spPr>
                     <a:xfrm>
                       <a:off x="0" y="0"/>
-                      <a:ext cx="9956800" cy="2819400"/>
+                      <a:ext cx="39827200" cy="11277600"/>
                     </a:xfrm>
                     <a:prstGeom prst="rect"/>
                   </pic:spPr>
@@ -1035,7 +1035,7 @@
       <w:r>
         <w:drawing>
           <wp:inline xmlns:a="http://schemas.openxmlformats.org/drawingml/2006/main" xmlns:pic="http://schemas.openxmlformats.org/drawingml/2006/picture">
-            <wp:extent cx="9956800" cy="7848600"/>
+            <wp:extent cx="39827200" cy="31394400"/>
             <wp:docPr id="4" name="Picture 4"/>
             <wp:cNvGraphicFramePr>
               <a:graphicFrameLocks noChangeAspect="1"/>
@@ -1056,7 +1056,7 @@
                   <pic:spPr>
                     <a:xfrm>
                       <a:off x="0" y="0"/>
-                      <a:ext cx="9956800" cy="7848600"/>
+                      <a:ext cx="39827200" cy="31394400"/>
                     </a:xfrm>
                     <a:prstGeom prst="rect"/>
                   </pic:spPr>
@@ -1084,7 +1084,7 @@
       <w:r>
         <w:drawing>
           <wp:inline xmlns:a="http://schemas.openxmlformats.org/drawingml/2006/main" xmlns:pic="http://schemas.openxmlformats.org/drawingml/2006/picture">
-            <wp:extent cx="9956800" cy="7594600"/>
+            <wp:extent cx="39827200" cy="30378400"/>
             <wp:docPr id="5" name="Picture 5"/>
             <wp:cNvGraphicFramePr>
               <a:graphicFrameLocks noChangeAspect="1"/>
@@ -1105,7 +1105,7 @@
                   <pic:spPr>
                     <a:xfrm>
                       <a:off x="0" y="0"/>
-                      <a:ext cx="9956800" cy="7594600"/>
+                      <a:ext cx="39827200" cy="30378400"/>
                     </a:xfrm>
                     <a:prstGeom prst="rect"/>
                   </pic:spPr>
@@ -1321,7 +1321,7 @@
       <w:r>
         <w:drawing>
           <wp:inline xmlns:a="http://schemas.openxmlformats.org/drawingml/2006/main" xmlns:pic="http://schemas.openxmlformats.org/drawingml/2006/picture">
-            <wp:extent cx="9956800" cy="7797800"/>
+            <wp:extent cx="39827200" cy="31191200"/>
             <wp:docPr id="6" name="Picture 6"/>
             <wp:cNvGraphicFramePr>
               <a:graphicFrameLocks noChangeAspect="1"/>
@@ -1342,7 +1342,7 @@
                   <pic:spPr>
                     <a:xfrm>
                       <a:off x="0" y="0"/>
-                      <a:ext cx="9956800" cy="7797800"/>
+                      <a:ext cx="39827200" cy="31191200"/>
                     </a:xfrm>
                     <a:prstGeom prst="rect"/>
                   </pic:spPr>
@@ -1446,7 +1446,7 @@
       <w:r>
         <w:drawing>
           <wp:inline xmlns:a="http://schemas.openxmlformats.org/drawingml/2006/main" xmlns:pic="http://schemas.openxmlformats.org/drawingml/2006/picture">
-            <wp:extent cx="9956800" cy="5981700"/>
+            <wp:extent cx="39827200" cy="23926800"/>
             <wp:docPr id="7" name="Picture 7"/>
             <wp:cNvGraphicFramePr>
               <a:graphicFrameLocks noChangeAspect="1"/>
@@ -1467,7 +1467,7 @@
                   <pic:spPr>
                     <a:xfrm>
                       <a:off x="0" y="0"/>
-                      <a:ext cx="9956800" cy="5981700"/>
+                      <a:ext cx="39827200" cy="23926800"/>
                     </a:xfrm>
                     <a:prstGeom prst="rect"/>
                   </pic:spPr>
@@ -1571,7 +1571,7 @@
       <w:r>
         <w:drawing>
           <wp:inline xmlns:a="http://schemas.openxmlformats.org/drawingml/2006/main" xmlns:pic="http://schemas.openxmlformats.org/drawingml/2006/picture">
-            <wp:extent cx="9956800" cy="12484100"/>
+            <wp:extent cx="39827200" cy="49936400"/>
             <wp:docPr id="8" name="Picture 8"/>
             <wp:cNvGraphicFramePr>
               <a:graphicFrameLocks noChangeAspect="1"/>
@@ -1592,7 +1592,7 @@
                   <pic:spPr>
                     <a:xfrm>
                       <a:off x="0" y="0"/>
-                      <a:ext cx="9956800" cy="12484100"/>
+                      <a:ext cx="39827200" cy="49936400"/>
                     </a:xfrm>
                     <a:prstGeom prst="rect"/>
                   </pic:spPr>
@@ -1662,7 +1662,7 @@
       <w:r>
         <w:drawing>
           <wp:inline xmlns:a="http://schemas.openxmlformats.org/drawingml/2006/main" xmlns:pic="http://schemas.openxmlformats.org/drawingml/2006/picture">
-            <wp:extent cx="9956800" cy="1638300"/>
+            <wp:extent cx="39827200" cy="6553200"/>
             <wp:docPr id="9" name="Picture 9"/>
             <wp:cNvGraphicFramePr>
               <a:graphicFrameLocks noChangeAspect="1"/>
@@ -1683,7 +1683,7 @@
                   <pic:spPr>
                     <a:xfrm>
                       <a:off x="0" y="0"/>
-                      <a:ext cx="9956800" cy="1638300"/>
+                      <a:ext cx="39827200" cy="6553200"/>
                     </a:xfrm>
                     <a:prstGeom prst="rect"/>
                   </pic:spPr>
@@ -1987,7 +1987,7 @@
       <w:r>
         <w:drawing>
           <wp:inline xmlns:a="http://schemas.openxmlformats.org/drawingml/2006/main" xmlns:pic="http://schemas.openxmlformats.org/drawingml/2006/picture">
-            <wp:extent cx="8839200" cy="7099300"/>
+            <wp:extent cx="35356800" cy="28397200"/>
             <wp:docPr id="10" name="Picture 10"/>
             <wp:cNvGraphicFramePr>
               <a:graphicFrameLocks noChangeAspect="1"/>
@@ -2008,7 +2008,7 @@
                   <pic:spPr>
                     <a:xfrm>
                       <a:off x="0" y="0"/>
-                      <a:ext cx="8839200" cy="7099300"/>
+                      <a:ext cx="35356800" cy="28397200"/>
                     </a:xfrm>
                     <a:prstGeom prst="rect"/>
                   </pic:spPr>
@@ -2173,7 +2173,7 @@
       <w:r>
         <w:drawing>
           <wp:inline xmlns:a="http://schemas.openxmlformats.org/drawingml/2006/main" xmlns:pic="http://schemas.openxmlformats.org/drawingml/2006/picture">
-            <wp:extent cx="9956800" cy="5486400"/>
+            <wp:extent cx="39827200" cy="21945600"/>
             <wp:docPr id="11" name="Picture 11"/>
             <wp:cNvGraphicFramePr>
               <a:graphicFrameLocks noChangeAspect="1"/>
@@ -2194,7 +2194,7 @@
                   <pic:spPr>
                     <a:xfrm>
                       <a:off x="0" y="0"/>
-                      <a:ext cx="9956800" cy="5486400"/>
+                      <a:ext cx="39827200" cy="21945600"/>
                     </a:xfrm>
                     <a:prstGeom prst="rect"/>
                   </pic:spPr>
@@ -2310,7 +2310,7 @@
       <w:r>
         <w:drawing>
           <wp:inline xmlns:a="http://schemas.openxmlformats.org/drawingml/2006/main" xmlns:pic="http://schemas.openxmlformats.org/drawingml/2006/picture">
-            <wp:extent cx="9956800" cy="3810000"/>
+            <wp:extent cx="39827200" cy="34493200"/>
             <wp:docPr id="12" name="Picture 12"/>
             <wp:cNvGraphicFramePr>
               <a:graphicFrameLocks noChangeAspect="1"/>
@@ -2331,7 +2331,7 @@
                   <pic:spPr>
                     <a:xfrm>
                       <a:off x="0" y="0"/>
-                      <a:ext cx="9956800" cy="3810000"/>
+                      <a:ext cx="39827200" cy="34493200"/>
                     </a:xfrm>
                     <a:prstGeom prst="rect"/>
                   </pic:spPr>
@@ -2359,7 +2359,7 @@
       <w:r>
         <w:drawing>
           <wp:inline xmlns:a="http://schemas.openxmlformats.org/drawingml/2006/main" xmlns:pic="http://schemas.openxmlformats.org/drawingml/2006/picture">
-            <wp:extent cx="9956800" cy="6578600"/>
+            <wp:extent cx="39827200" cy="26314400"/>
             <wp:docPr id="13" name="Picture 13"/>
             <wp:cNvGraphicFramePr>
               <a:graphicFrameLocks noChangeAspect="1"/>
@@ -2380,7 +2380,7 @@
                   <pic:spPr>
                     <a:xfrm>
                       <a:off x="0" y="0"/>
-                      <a:ext cx="9956800" cy="6578600"/>
+                      <a:ext cx="39827200" cy="26314400"/>
                     </a:xfrm>
                     <a:prstGeom prst="rect"/>
                   </pic:spPr>
@@ -2753,7 +2753,7 @@
       <w:r>
         <w:drawing>
           <wp:inline xmlns:a="http://schemas.openxmlformats.org/drawingml/2006/main" xmlns:pic="http://schemas.openxmlformats.org/drawingml/2006/picture">
-            <wp:extent cx="2133600" cy="13220700"/>
+            <wp:extent cx="8534400" cy="52882800"/>
             <wp:docPr id="14" name="Picture 14"/>
             <wp:cNvGraphicFramePr>
               <a:graphicFrameLocks noChangeAspect="1"/>
@@ -2774,7 +2774,7 @@
                   <pic:spPr>
                     <a:xfrm>
                       <a:off x="0" y="0"/>
-                      <a:ext cx="2133600" cy="13220700"/>
+                      <a:ext cx="8534400" cy="52882800"/>
                     </a:xfrm>
                     <a:prstGeom prst="rect"/>
                   </pic:spPr>
@@ -2893,7 +2893,7 @@
       <w:r>
         <w:drawing>
           <wp:inline xmlns:a="http://schemas.openxmlformats.org/drawingml/2006/main" xmlns:pic="http://schemas.openxmlformats.org/drawingml/2006/picture">
-            <wp:extent cx="8191500" cy="8737600"/>
+            <wp:extent cx="32766000" cy="34950400"/>
             <wp:docPr id="15" name="Picture 15"/>
             <wp:cNvGraphicFramePr>
               <a:graphicFrameLocks noChangeAspect="1"/>
@@ -2914,7 +2914,7 @@
                   <pic:spPr>
                     <a:xfrm>
                       <a:off x="0" y="0"/>
-                      <a:ext cx="8191500" cy="8737600"/>
+                      <a:ext cx="32766000" cy="34950400"/>
                     </a:xfrm>
                     <a:prstGeom prst="rect"/>
                   </pic:spPr>
@@ -3399,7 +3399,7 @@
       <w:r>
         <w:drawing>
           <wp:inline xmlns:a="http://schemas.openxmlformats.org/drawingml/2006/main" xmlns:pic="http://schemas.openxmlformats.org/drawingml/2006/picture">
-            <wp:extent cx="5473700" cy="11150600"/>
+            <wp:extent cx="21894800" cy="44602400"/>
             <wp:docPr id="16" name="Picture 16"/>
             <wp:cNvGraphicFramePr>
               <a:graphicFrameLocks noChangeAspect="1"/>
@@ -3420,7 +3420,7 @@
                   <pic:spPr>
                     <a:xfrm>
                       <a:off x="0" y="0"/>
-                      <a:ext cx="5473700" cy="11150600"/>
+                      <a:ext cx="21894800" cy="44602400"/>
                     </a:xfrm>
                     <a:prstGeom prst="rect"/>
                   </pic:spPr>

</xml_diff>